<commit_message>
Adiciona primeiros itens de configuracao de Requisitos e Manuais
</commit_message>
<xml_diff>
--- a/Requisitos&Manuais/Requisitos_e_Manuais_SISTAC.docx
+++ b/Requisitos&Manuais/Requisitos_e_Manuais_SISTAC.docx
@@ -1,6 +1,6 @@
 
 <file path=word/document.xml><?xml version="1.0" encoding="utf-8"?>
-<w:document xmlns:wpc="http://schemas.microsoft.com/office/word/2010/wordprocessingCanvas" xmlns:cx="http://schemas.microsoft.com/office/drawing/2014/chartex" xmlns:cx1="http://schemas.microsoft.com/office/drawing/2015/9/8/chartex" xmlns:cx2="http://schemas.microsoft.com/office/drawing/2015/10/21/chartex" xmlns:cx3="http://schemas.microsoft.com/office/drawing/2016/5/9/chartex" xmlns:cx4="http://schemas.microsoft.com/office/drawing/2016/5/10/chartex" xmlns:cx5="http://schemas.microsoft.com/office/drawing/2016/5/11/chartex" xmlns:cx6="http://schemas.microsoft.com/office/drawing/2016/5/12/chartex" xmlns:cx7="http://schemas.microsoft.com/office/drawing/2016/5/13/chartex" xmlns:cx8="http://schemas.microsoft.com/office/drawing/2016/5/14/chartex" xmlns:mc="http://schemas.openxmlformats.org/markup-compatibility/2006" xmlns:aink="http://schemas.microsoft.com/office/drawing/2016/ink" xmlns:am3d="http://schemas.microsoft.com/office/drawing/2017/model3d" xmlns:o="urn:schemas-microsoft-com:office:office" xmlns:oel="http://schemas.microsoft.com/office/2019/extlst" xmlns:r="http://schemas.openxmlformats.org/officeDocument/2006/relationships" xmlns:m="http://schemas.openxmlformats.org/officeDocument/2006/math" xmlns:v="urn:schemas-microsoft-com:vml" xmlns:wp14="http://schemas.microsoft.com/office/word/2010/wordprocessingDrawing" xmlns:wp="http://schemas.openxmlformats.org/drawingml/2006/wordprocessingDrawing" xmlns:w10="urn:schemas-microsoft-com:office:word" xmlns:w="http://schemas.openxmlformats.org/wordprocessingml/2006/main" xmlns:w14="http://schemas.microsoft.com/office/word/2010/wordml" xmlns:w15="http://schemas.microsoft.com/office/word/2012/wordml" xmlns:w16cex="http://schemas.microsoft.com/office/word/2018/wordml/cex" xmlns:w16cid="http://schemas.microsoft.com/office/word/2016/wordml/cid" xmlns:w16="http://schemas.microsoft.com/office/word/2018/wordml" xmlns:w16sdtdh="http://schemas.microsoft.com/office/word/2020/wordml/sdtdatahash" xmlns:w16se="http://schemas.microsoft.com/office/word/2015/wordml/symex" xmlns:wpg="http://schemas.microsoft.com/office/word/2010/wordprocessingGroup" xmlns:wpi="http://schemas.microsoft.com/office/word/2010/wordprocessingInk" xmlns:wne="http://schemas.microsoft.com/office/word/2006/wordml" xmlns:wps="http://schemas.microsoft.com/office/word/2010/wordprocessingShape" mc:Ignorable="w14 w15 w16se w16cid w16 w16cex w16sdtdh wp14">
+<w:document xmlns:wpc="http://schemas.microsoft.com/office/word/2010/wordprocessingCanvas" xmlns:cx="http://schemas.microsoft.com/office/drawing/2014/chartex" xmlns:cx1="http://schemas.microsoft.com/office/drawing/2015/9/8/chartex" xmlns:cx2="http://schemas.microsoft.com/office/drawing/2015/10/21/chartex" xmlns:cx3="http://schemas.microsoft.com/office/drawing/2016/5/9/chartex" xmlns:cx4="http://schemas.microsoft.com/office/drawing/2016/5/10/chartex" xmlns:cx5="http://schemas.microsoft.com/office/drawing/2016/5/11/chartex" xmlns:cx6="http://schemas.microsoft.com/office/drawing/2016/5/12/chartex" xmlns:cx7="http://schemas.microsoft.com/office/drawing/2016/5/13/chartex" xmlns:cx8="http://schemas.microsoft.com/office/drawing/2016/5/14/chartex" xmlns:mc="http://schemas.openxmlformats.org/markup-compatibility/2006" xmlns:aink="http://schemas.microsoft.com/office/drawing/2016/ink" xmlns:am3d="http://schemas.microsoft.com/office/drawing/2017/model3d" xmlns:o="urn:schemas-microsoft-com:office:office" xmlns:oel="http://schemas.microsoft.com/office/2019/extlst" xmlns:r="http://schemas.openxmlformats.org/officeDocument/2006/relationships" xmlns:m="http://schemas.openxmlformats.org/officeDocument/2006/math" xmlns:v="urn:schemas-microsoft-com:vml" xmlns:wp14="http://schemas.microsoft.com/office/word/2010/wordprocessingDrawing" xmlns:wp="http://schemas.openxmlformats.org/drawingml/2006/wordprocessingDrawing" xmlns:w10="urn:schemas-microsoft-com:office:word" xmlns:w="http://schemas.openxmlformats.org/wordprocessingml/2006/main" xmlns:w14="http://schemas.microsoft.com/office/word/2010/wordml" xmlns:w15="http://schemas.microsoft.com/office/word/2012/wordml" xmlns:w16cex="http://schemas.microsoft.com/office/word/2018/wordml/cex" xmlns:w16cid="http://schemas.microsoft.com/office/word/2016/wordml/cid" xmlns:w16="http://schemas.microsoft.com/office/word/2018/wordml" xmlns:w16du="http://schemas.microsoft.com/office/word/2023/wordml/word16du" xmlns:w16sdtdh="http://schemas.microsoft.com/office/word/2020/wordml/sdtdatahash" xmlns:w16sdtfl="http://schemas.microsoft.com/office/word/2024/wordml/sdtformatlock" xmlns:w16se="http://schemas.microsoft.com/office/word/2015/wordml/symex" xmlns:wpg="http://schemas.microsoft.com/office/word/2010/wordprocessingGroup" xmlns:wpi="http://schemas.microsoft.com/office/word/2010/wordprocessingInk" xmlns:wne="http://schemas.microsoft.com/office/word/2006/wordml" xmlns:wps="http://schemas.microsoft.com/office/word/2010/wordprocessingShape" mc:Ignorable="w14 w15 w16se w16cid w16 w16cex w16sdtdh w16sdtfl w16du wp14">
   <w:body>
     <w:p>
       <w:pPr>
@@ -168,15 +168,43 @@
           <w:sz w:val="24"/>
           <w:szCs w:val="24"/>
         </w:rPr>
-        <w:t>Este documento descreve os requisitos funcionais, requisitos não-funcionais, regras de negócio e os manuais de usuário do Sistema Acadêmico Universitário (SISTAC), desenvolvido como parte da disciplina de Gerência de Configuração de Software (ESW432). O conteúdo aqui apresentado complementa o modelo de dados já definido no item de configuração ICS-BD-SCHEMA-001 (database/BANCO_DE_DADOS.md), detalhando o comportamento esperado do sistema sob a ótica dos três perfis de usuário: Aluno, Professor e Administrado</w:t>
+        <w:t xml:space="preserve">Este documento descreve os requisitos funcionais, requisitos não-funcionais, regras de negócio e os manuais de usuário do Sistema Acadêmico Universitário (SISTAC), desenvolvido como parte da disciplina de Gerência de Configuração de Software (ESW432). </w:t>
       </w:r>
+    </w:p>
+    <w:p>
+      <w:pPr>
+        <w:spacing w:after="160"/>
+        <w:rPr>
+          <w:rFonts w:ascii="Arial" w:hAnsi="Arial" w:cs="Arial"/>
+          <w:sz w:val="24"/>
+          <w:szCs w:val="24"/>
+        </w:rPr>
+      </w:pPr>
       <w:r>
         <w:rPr>
           <w:rFonts w:ascii="Arial" w:hAnsi="Arial" w:cs="Arial"/>
           <w:sz w:val="24"/>
           <w:szCs w:val="24"/>
         </w:rPr>
-        <w:t>r/Secretaria Acadêmica.</w:t>
+        <w:t>O conteúdo aqui apresentado complementa o modelo de dados já definido no item de configuração ICS-BD-SCHEMA-001 (</w:t>
+      </w:r>
+      <w:proofErr w:type="spellStart"/>
+      <w:r>
+        <w:rPr>
+          <w:rFonts w:ascii="Arial" w:hAnsi="Arial" w:cs="Arial"/>
+          <w:sz w:val="24"/>
+          <w:szCs w:val="24"/>
+        </w:rPr>
+        <w:t>database</w:t>
+      </w:r>
+      <w:proofErr w:type="spellEnd"/>
+      <w:r>
+        <w:rPr>
+          <w:rFonts w:ascii="Arial" w:hAnsi="Arial" w:cs="Arial"/>
+          <w:sz w:val="24"/>
+          <w:szCs w:val="24"/>
+        </w:rPr>
+        <w:t>/BANCO_DE_DADOS.md), detalhando o comportamento esperado do sistema sob a ótica dos três perfis de usuário: Aluno, Professor e Administrador/Secretaria Acadêmica.</w:t>
       </w:r>
     </w:p>
     <w:p>
@@ -239,12 +267,6 @@
         <w:gridCol w:w="2526"/>
       </w:tblGrid>
       <w:tr>
-        <w:tblPrEx>
-          <w:tblCellMar>
-            <w:top w:w="0" w:type="dxa"/>
-            <w:bottom w:w="0" w:type="dxa"/>
-          </w:tblCellMar>
-        </w:tblPrEx>
         <w:trPr>
           <w:tblHeader/>
         </w:trPr>
@@ -346,12 +368,6 @@
         </w:tc>
       </w:tr>
       <w:tr>
-        <w:tblPrEx>
-          <w:tblCellMar>
-            <w:top w:w="0" w:type="dxa"/>
-            <w:bottom w:w="0" w:type="dxa"/>
-          </w:tblCellMar>
-        </w:tblPrEx>
         <w:tc>
           <w:tcPr>
             <w:tcW w:w="1000" w:type="dxa"/>
@@ -438,12 +454,6 @@
         </w:tc>
       </w:tr>
       <w:tr>
-        <w:tblPrEx>
-          <w:tblCellMar>
-            <w:top w:w="0" w:type="dxa"/>
-            <w:bottom w:w="0" w:type="dxa"/>
-          </w:tblCellMar>
-        </w:tblPrEx>
         <w:tc>
           <w:tcPr>
             <w:tcW w:w="1000" w:type="dxa"/>
@@ -530,12 +540,6 @@
         </w:tc>
       </w:tr>
       <w:tr>
-        <w:tblPrEx>
-          <w:tblCellMar>
-            <w:top w:w="0" w:type="dxa"/>
-            <w:bottom w:w="0" w:type="dxa"/>
-          </w:tblCellMar>
-        </w:tblPrEx>
         <w:tc>
           <w:tcPr>
             <w:tcW w:w="1000" w:type="dxa"/>
@@ -622,12 +626,6 @@
         </w:tc>
       </w:tr>
       <w:tr>
-        <w:tblPrEx>
-          <w:tblCellMar>
-            <w:top w:w="0" w:type="dxa"/>
-            <w:bottom w:w="0" w:type="dxa"/>
-          </w:tblCellMar>
-        </w:tblPrEx>
         <w:tc>
           <w:tcPr>
             <w:tcW w:w="1000" w:type="dxa"/>
@@ -714,12 +712,6 @@
         </w:tc>
       </w:tr>
       <w:tr>
-        <w:tblPrEx>
-          <w:tblCellMar>
-            <w:top w:w="0" w:type="dxa"/>
-            <w:bottom w:w="0" w:type="dxa"/>
-          </w:tblCellMar>
-        </w:tblPrEx>
         <w:tc>
           <w:tcPr>
             <w:tcW w:w="1000" w:type="dxa"/>
@@ -806,12 +798,6 @@
         </w:tc>
       </w:tr>
       <w:tr>
-        <w:tblPrEx>
-          <w:tblCellMar>
-            <w:top w:w="0" w:type="dxa"/>
-            <w:bottom w:w="0" w:type="dxa"/>
-          </w:tblCellMar>
-        </w:tblPrEx>
         <w:tc>
           <w:tcPr>
             <w:tcW w:w="1000" w:type="dxa"/>
@@ -898,12 +884,6 @@
         </w:tc>
       </w:tr>
       <w:tr>
-        <w:tblPrEx>
-          <w:tblCellMar>
-            <w:top w:w="0" w:type="dxa"/>
-            <w:bottom w:w="0" w:type="dxa"/>
-          </w:tblCellMar>
-        </w:tblPrEx>
         <w:tc>
           <w:tcPr>
             <w:tcW w:w="1000" w:type="dxa"/>
@@ -928,6 +908,7 @@
                 <w:sz w:val="24"/>
                 <w:szCs w:val="24"/>
               </w:rPr>
+              <w:lastRenderedPageBreak/>
               <w:t>RF07</w:t>
             </w:r>
           </w:p>
@@ -990,12 +971,6 @@
         </w:tc>
       </w:tr>
       <w:tr>
-        <w:tblPrEx>
-          <w:tblCellMar>
-            <w:top w:w="0" w:type="dxa"/>
-            <w:bottom w:w="0" w:type="dxa"/>
-          </w:tblCellMar>
-        </w:tblPrEx>
         <w:tc>
           <w:tcPr>
             <w:tcW w:w="1000" w:type="dxa"/>
@@ -1082,12 +1057,6 @@
         </w:tc>
       </w:tr>
       <w:tr>
-        <w:tblPrEx>
-          <w:tblCellMar>
-            <w:top w:w="0" w:type="dxa"/>
-            <w:bottom w:w="0" w:type="dxa"/>
-          </w:tblCellMar>
-        </w:tblPrEx>
         <w:tc>
           <w:tcPr>
             <w:tcW w:w="1000" w:type="dxa"/>
@@ -1174,12 +1143,6 @@
         </w:tc>
       </w:tr>
       <w:tr>
-        <w:tblPrEx>
-          <w:tblCellMar>
-            <w:top w:w="0" w:type="dxa"/>
-            <w:bottom w:w="0" w:type="dxa"/>
-          </w:tblCellMar>
-        </w:tblPrEx>
         <w:tc>
           <w:tcPr>
             <w:tcW w:w="1000" w:type="dxa"/>
@@ -1282,7 +1245,6 @@
           <w:sz w:val="24"/>
           <w:szCs w:val="24"/>
         </w:rPr>
-        <w:lastRenderedPageBreak/>
         <w:t>3. Requisitos Não-Funcionais (RNF)</w:t>
       </w:r>
     </w:p>
@@ -1327,12 +1289,6 @@
         <w:gridCol w:w="6237"/>
       </w:tblGrid>
       <w:tr>
-        <w:tblPrEx>
-          <w:tblCellMar>
-            <w:top w:w="0" w:type="dxa"/>
-            <w:bottom w:w="0" w:type="dxa"/>
-          </w:tblCellMar>
-        </w:tblPrEx>
         <w:trPr>
           <w:tblHeader/>
         </w:trPr>
@@ -1434,12 +1390,6 @@
         </w:tc>
       </w:tr>
       <w:tr>
-        <w:tblPrEx>
-          <w:tblCellMar>
-            <w:top w:w="0" w:type="dxa"/>
-            <w:bottom w:w="0" w:type="dxa"/>
-          </w:tblCellMar>
-        </w:tblPrEx>
         <w:tc>
           <w:tcPr>
             <w:tcW w:w="900" w:type="dxa"/>
@@ -1526,12 +1476,6 @@
         </w:tc>
       </w:tr>
       <w:tr>
-        <w:tblPrEx>
-          <w:tblCellMar>
-            <w:top w:w="0" w:type="dxa"/>
-            <w:bottom w:w="0" w:type="dxa"/>
-          </w:tblCellMar>
-        </w:tblPrEx>
         <w:tc>
           <w:tcPr>
             <w:tcW w:w="900" w:type="dxa"/>
@@ -1618,12 +1562,6 @@
         </w:tc>
       </w:tr>
       <w:tr>
-        <w:tblPrEx>
-          <w:tblCellMar>
-            <w:top w:w="0" w:type="dxa"/>
-            <w:bottom w:w="0" w:type="dxa"/>
-          </w:tblCellMar>
-        </w:tblPrEx>
         <w:tc>
           <w:tcPr>
             <w:tcW w:w="900" w:type="dxa"/>
@@ -1710,12 +1648,6 @@
         </w:tc>
       </w:tr>
       <w:tr>
-        <w:tblPrEx>
-          <w:tblCellMar>
-            <w:top w:w="0" w:type="dxa"/>
-            <w:bottom w:w="0" w:type="dxa"/>
-          </w:tblCellMar>
-        </w:tblPrEx>
         <w:tc>
           <w:tcPr>
             <w:tcW w:w="900" w:type="dxa"/>
@@ -1802,12 +1734,6 @@
         </w:tc>
       </w:tr>
       <w:tr>
-        <w:tblPrEx>
-          <w:tblCellMar>
-            <w:top w:w="0" w:type="dxa"/>
-            <w:bottom w:w="0" w:type="dxa"/>
-          </w:tblCellMar>
-        </w:tblPrEx>
         <w:tc>
           <w:tcPr>
             <w:tcW w:w="900" w:type="dxa"/>
@@ -1894,12 +1820,6 @@
         </w:tc>
       </w:tr>
       <w:tr>
-        <w:tblPrEx>
-          <w:tblCellMar>
-            <w:top w:w="0" w:type="dxa"/>
-            <w:bottom w:w="0" w:type="dxa"/>
-          </w:tblCellMar>
-        </w:tblPrEx>
         <w:tc>
           <w:tcPr>
             <w:tcW w:w="900" w:type="dxa"/>
@@ -1980,18 +1900,30 @@
                 <w:sz w:val="24"/>
                 <w:szCs w:val="24"/>
               </w:rPr>
-              <w:t>Toda alteração de notas, faltas e status deve manter registro de data e hora (timestamps), conforme já previsto no modelo de dados.</w:t>
+              <w:t>Toda alteração de notas, faltas e status deve manter registro de data e hora (</w:t>
+            </w:r>
+            <w:proofErr w:type="spellStart"/>
+            <w:r>
+              <w:rPr>
+                <w:rFonts w:ascii="Arial" w:hAnsi="Arial" w:cs="Arial"/>
+                <w:sz w:val="24"/>
+                <w:szCs w:val="24"/>
+              </w:rPr>
+              <w:t>timestamps</w:t>
+            </w:r>
+            <w:proofErr w:type="spellEnd"/>
+            <w:r>
+              <w:rPr>
+                <w:rFonts w:ascii="Arial" w:hAnsi="Arial" w:cs="Arial"/>
+                <w:sz w:val="24"/>
+                <w:szCs w:val="24"/>
+              </w:rPr>
+              <w:t>), conforme já previsto no modelo de dados.</w:t>
             </w:r>
           </w:p>
         </w:tc>
       </w:tr>
       <w:tr>
-        <w:tblPrEx>
-          <w:tblCellMar>
-            <w:top w:w="0" w:type="dxa"/>
-            <w:bottom w:w="0" w:type="dxa"/>
-          </w:tblCellMar>
-        </w:tblPrEx>
         <w:tc>
           <w:tcPr>
             <w:tcW w:w="900" w:type="dxa"/>
@@ -2112,7 +2044,26 @@
           <w:sz w:val="24"/>
           <w:szCs w:val="24"/>
         </w:rPr>
-        <w:t>As regras de negócio abaixo derivam diretamente das restrições (constraints) implementadas no modelo relacional do banco de dados.</w:t>
+        <w:lastRenderedPageBreak/>
+        <w:t>As regras de negócio abaixo derivam diretamente das restrições (</w:t>
+      </w:r>
+      <w:proofErr w:type="spellStart"/>
+      <w:r>
+        <w:rPr>
+          <w:rFonts w:ascii="Arial" w:hAnsi="Arial" w:cs="Arial"/>
+          <w:sz w:val="24"/>
+          <w:szCs w:val="24"/>
+        </w:rPr>
+        <w:t>constraints</w:t>
+      </w:r>
+      <w:proofErr w:type="spellEnd"/>
+      <w:r>
+        <w:rPr>
+          <w:rFonts w:ascii="Arial" w:hAnsi="Arial" w:cs="Arial"/>
+          <w:sz w:val="24"/>
+          <w:szCs w:val="24"/>
+        </w:rPr>
+        <w:t>) implementadas no modelo relacional do banco de dados.</w:t>
       </w:r>
     </w:p>
     <w:tbl>
@@ -2137,12 +2088,6 @@
         <w:gridCol w:w="8126"/>
       </w:tblGrid>
       <w:tr>
-        <w:tblPrEx>
-          <w:tblCellMar>
-            <w:top w:w="0" w:type="dxa"/>
-            <w:bottom w:w="0" w:type="dxa"/>
-          </w:tblCellMar>
-        </w:tblPrEx>
         <w:trPr>
           <w:tblHeader/>
         </w:trPr>
@@ -2212,12 +2157,6 @@
         </w:tc>
       </w:tr>
       <w:tr>
-        <w:tblPrEx>
-          <w:tblCellMar>
-            <w:top w:w="0" w:type="dxa"/>
-            <w:bottom w:w="0" w:type="dxa"/>
-          </w:tblCellMar>
-        </w:tblPrEx>
         <w:tc>
           <w:tcPr>
             <w:tcW w:w="900" w:type="dxa"/>
@@ -2276,12 +2215,6 @@
         </w:tc>
       </w:tr>
       <w:tr>
-        <w:tblPrEx>
-          <w:tblCellMar>
-            <w:top w:w="0" w:type="dxa"/>
-            <w:bottom w:w="0" w:type="dxa"/>
-          </w:tblCellMar>
-        </w:tblPrEx>
         <w:tc>
           <w:tcPr>
             <w:tcW w:w="900" w:type="dxa"/>
@@ -2340,12 +2273,6 @@
         </w:tc>
       </w:tr>
       <w:tr>
-        <w:tblPrEx>
-          <w:tblCellMar>
-            <w:top w:w="0" w:type="dxa"/>
-            <w:bottom w:w="0" w:type="dxa"/>
-          </w:tblCellMar>
-        </w:tblPrEx>
         <w:tc>
           <w:tcPr>
             <w:tcW w:w="900" w:type="dxa"/>
@@ -2404,12 +2331,6 @@
         </w:tc>
       </w:tr>
       <w:tr>
-        <w:tblPrEx>
-          <w:tblCellMar>
-            <w:top w:w="0" w:type="dxa"/>
-            <w:bottom w:w="0" w:type="dxa"/>
-          </w:tblCellMar>
-        </w:tblPrEx>
         <w:tc>
           <w:tcPr>
             <w:tcW w:w="900" w:type="dxa"/>
@@ -2468,12 +2389,6 @@
         </w:tc>
       </w:tr>
       <w:tr>
-        <w:tblPrEx>
-          <w:tblCellMar>
-            <w:top w:w="0" w:type="dxa"/>
-            <w:bottom w:w="0" w:type="dxa"/>
-          </w:tblCellMar>
-        </w:tblPrEx>
         <w:tc>
           <w:tcPr>
             <w:tcW w:w="900" w:type="dxa"/>
@@ -2532,12 +2447,6 @@
         </w:tc>
       </w:tr>
       <w:tr>
-        <w:tblPrEx>
-          <w:tblCellMar>
-            <w:top w:w="0" w:type="dxa"/>
-            <w:bottom w:w="0" w:type="dxa"/>
-          </w:tblCellMar>
-        </w:tblPrEx>
         <w:tc>
           <w:tcPr>
             <w:tcW w:w="900" w:type="dxa"/>
@@ -2596,12 +2505,6 @@
         </w:tc>
       </w:tr>
       <w:tr>
-        <w:tblPrEx>
-          <w:tblCellMar>
-            <w:top w:w="0" w:type="dxa"/>
-            <w:bottom w:w="0" w:type="dxa"/>
-          </w:tblCellMar>
-        </w:tblPrEx>
         <w:tc>
           <w:tcPr>
             <w:tcW w:w="900" w:type="dxa"/>
@@ -2720,12 +2623,6 @@
         <w:gridCol w:w="4526"/>
       </w:tblGrid>
       <w:tr>
-        <w:tblPrEx>
-          <w:tblCellMar>
-            <w:top w:w="0" w:type="dxa"/>
-            <w:bottom w:w="0" w:type="dxa"/>
-          </w:tblCellMar>
-        </w:tblPrEx>
         <w:trPr>
           <w:tblHeader/>
         </w:trPr>
@@ -2757,7 +2654,6 @@
                 <w:sz w:val="24"/>
                 <w:szCs w:val="24"/>
               </w:rPr>
-              <w:lastRenderedPageBreak/>
               <w:t>RF</w:t>
             </w:r>
           </w:p>
@@ -2828,12 +2724,6 @@
         </w:tc>
       </w:tr>
       <w:tr>
-        <w:tblPrEx>
-          <w:tblCellMar>
-            <w:top w:w="0" w:type="dxa"/>
-            <w:bottom w:w="0" w:type="dxa"/>
-          </w:tblCellMar>
-        </w:tblPrEx>
         <w:tc>
           <w:tcPr>
             <w:tcW w:w="1000" w:type="dxa"/>
@@ -2920,12 +2810,6 @@
         </w:tc>
       </w:tr>
       <w:tr>
-        <w:tblPrEx>
-          <w:tblCellMar>
-            <w:top w:w="0" w:type="dxa"/>
-            <w:bottom w:w="0" w:type="dxa"/>
-          </w:tblCellMar>
-        </w:tblPrEx>
         <w:tc>
           <w:tcPr>
             <w:tcW w:w="1000" w:type="dxa"/>
@@ -3012,12 +2896,6 @@
         </w:tc>
       </w:tr>
       <w:tr>
-        <w:tblPrEx>
-          <w:tblCellMar>
-            <w:top w:w="0" w:type="dxa"/>
-            <w:bottom w:w="0" w:type="dxa"/>
-          </w:tblCellMar>
-        </w:tblPrEx>
         <w:tc>
           <w:tcPr>
             <w:tcW w:w="1000" w:type="dxa"/>
@@ -3104,12 +2982,6 @@
         </w:tc>
       </w:tr>
       <w:tr>
-        <w:tblPrEx>
-          <w:tblCellMar>
-            <w:top w:w="0" w:type="dxa"/>
-            <w:bottom w:w="0" w:type="dxa"/>
-          </w:tblCellMar>
-        </w:tblPrEx>
         <w:tc>
           <w:tcPr>
             <w:tcW w:w="1000" w:type="dxa"/>
@@ -3196,12 +3068,6 @@
         </w:tc>
       </w:tr>
       <w:tr>
-        <w:tblPrEx>
-          <w:tblCellMar>
-            <w:top w:w="0" w:type="dxa"/>
-            <w:bottom w:w="0" w:type="dxa"/>
-          </w:tblCellMar>
-        </w:tblPrEx>
         <w:tc>
           <w:tcPr>
             <w:tcW w:w="1000" w:type="dxa"/>
@@ -3288,12 +3154,6 @@
         </w:tc>
       </w:tr>
       <w:tr>
-        <w:tblPrEx>
-          <w:tblCellMar>
-            <w:top w:w="0" w:type="dxa"/>
-            <w:bottom w:w="0" w:type="dxa"/>
-          </w:tblCellMar>
-        </w:tblPrEx>
         <w:tc>
           <w:tcPr>
             <w:tcW w:w="1000" w:type="dxa"/>
@@ -3380,12 +3240,6 @@
         </w:tc>
       </w:tr>
       <w:tr>
-        <w:tblPrEx>
-          <w:tblCellMar>
-            <w:top w:w="0" w:type="dxa"/>
-            <w:bottom w:w="0" w:type="dxa"/>
-          </w:tblCellMar>
-        </w:tblPrEx>
         <w:tc>
           <w:tcPr>
             <w:tcW w:w="1000" w:type="dxa"/>
@@ -3432,6 +3286,7 @@
                 <w:szCs w:val="24"/>
               </w:rPr>
             </w:pPr>
+            <w:proofErr w:type="gramStart"/>
             <w:r>
               <w:rPr>
                 <w:rFonts w:ascii="Arial" w:hAnsi="Arial" w:cs="Arial"/>
@@ -3440,6 +3295,7 @@
               </w:rPr>
               <w:t>matriculas</w:t>
             </w:r>
+            <w:proofErr w:type="gramEnd"/>
           </w:p>
         </w:tc>
         <w:tc>
@@ -3472,12 +3328,6 @@
         </w:tc>
       </w:tr>
       <w:tr>
-        <w:tblPrEx>
-          <w:tblCellMar>
-            <w:top w:w="0" w:type="dxa"/>
-            <w:bottom w:w="0" w:type="dxa"/>
-          </w:tblCellMar>
-        </w:tblPrEx>
         <w:tc>
           <w:tcPr>
             <w:tcW w:w="1000" w:type="dxa"/>
@@ -3524,6 +3374,7 @@
                 <w:szCs w:val="24"/>
               </w:rPr>
             </w:pPr>
+            <w:proofErr w:type="spellStart"/>
             <w:r>
               <w:rPr>
                 <w:rFonts w:ascii="Arial" w:hAnsi="Arial" w:cs="Arial"/>
@@ -3532,6 +3383,7 @@
               </w:rPr>
               <w:t>avaliacoes</w:t>
             </w:r>
+            <w:proofErr w:type="spellEnd"/>
           </w:p>
         </w:tc>
         <w:tc>
@@ -3564,12 +3416,6 @@
         </w:tc>
       </w:tr>
       <w:tr>
-        <w:tblPrEx>
-          <w:tblCellMar>
-            <w:top w:w="0" w:type="dxa"/>
-            <w:bottom w:w="0" w:type="dxa"/>
-          </w:tblCellMar>
-        </w:tblPrEx>
         <w:tc>
           <w:tcPr>
             <w:tcW w:w="1000" w:type="dxa"/>
@@ -3616,14 +3462,34 @@
                 <w:szCs w:val="24"/>
               </w:rPr>
             </w:pPr>
-            <w:r>
-              <w:rPr>
-                <w:rFonts w:ascii="Arial" w:hAnsi="Arial" w:cs="Arial"/>
-                <w:sz w:val="24"/>
-                <w:szCs w:val="24"/>
-              </w:rPr>
-              <w:t>avaliacoes, matriculas</w:t>
-            </w:r>
+            <w:proofErr w:type="spellStart"/>
+            <w:r>
+              <w:rPr>
+                <w:rFonts w:ascii="Arial" w:hAnsi="Arial" w:cs="Arial"/>
+                <w:sz w:val="24"/>
+                <w:szCs w:val="24"/>
+              </w:rPr>
+              <w:t>avaliacoes</w:t>
+            </w:r>
+            <w:proofErr w:type="spellEnd"/>
+            <w:r>
+              <w:rPr>
+                <w:rFonts w:ascii="Arial" w:hAnsi="Arial" w:cs="Arial"/>
+                <w:sz w:val="24"/>
+                <w:szCs w:val="24"/>
+              </w:rPr>
+              <w:t xml:space="preserve">, </w:t>
+            </w:r>
+            <w:proofErr w:type="gramStart"/>
+            <w:r>
+              <w:rPr>
+                <w:rFonts w:ascii="Arial" w:hAnsi="Arial" w:cs="Arial"/>
+                <w:sz w:val="24"/>
+                <w:szCs w:val="24"/>
+              </w:rPr>
+              <w:t>matriculas</w:t>
+            </w:r>
+            <w:proofErr w:type="gramEnd"/>
           </w:p>
         </w:tc>
         <w:tc>
@@ -3656,12 +3522,6 @@
         </w:tc>
       </w:tr>
       <w:tr>
-        <w:tblPrEx>
-          <w:tblCellMar>
-            <w:top w:w="0" w:type="dxa"/>
-            <w:bottom w:w="0" w:type="dxa"/>
-          </w:tblCellMar>
-        </w:tblPrEx>
         <w:tc>
           <w:tcPr>
             <w:tcW w:w="1000" w:type="dxa"/>
@@ -3714,8 +3574,18 @@
                 <w:sz w:val="24"/>
                 <w:szCs w:val="24"/>
               </w:rPr>
-              <w:t>alunos, matriculas</w:t>
-            </w:r>
+              <w:t xml:space="preserve">alunos, </w:t>
+            </w:r>
+            <w:proofErr w:type="gramStart"/>
+            <w:r>
+              <w:rPr>
+                <w:rFonts w:ascii="Arial" w:hAnsi="Arial" w:cs="Arial"/>
+                <w:sz w:val="24"/>
+                <w:szCs w:val="24"/>
+              </w:rPr>
+              <w:t>matriculas</w:t>
+            </w:r>
+            <w:proofErr w:type="gramEnd"/>
           </w:p>
         </w:tc>
         <w:tc>
@@ -3801,6 +3671,7 @@
           <w:sz w:val="24"/>
           <w:szCs w:val="24"/>
         </w:rPr>
+        <w:lastRenderedPageBreak/>
         <w:t>6.1 Manual do Aluno</w:t>
       </w:r>
     </w:p>
@@ -3870,7 +3741,25 @@
           <w:sz w:val="24"/>
           <w:szCs w:val="24"/>
         </w:rPr>
-        <w:t>Selecione a turma desejada e clique em "Matricular-se"; o sistema valida a disponibilidade de vagas antes de confirmar.</w:t>
+        <w:t xml:space="preserve">Selecione a turma desejada e clique em "Matricular-se"; o sistema </w:t>
+      </w:r>
+      <w:proofErr w:type="spellStart"/>
+      <w:r>
+        <w:rPr>
+          <w:rFonts w:ascii="Arial" w:hAnsi="Arial" w:cs="Arial"/>
+          <w:sz w:val="24"/>
+          <w:szCs w:val="24"/>
+        </w:rPr>
+        <w:t>valida</w:t>
+      </w:r>
+      <w:proofErr w:type="spellEnd"/>
+      <w:r>
+        <w:rPr>
+          <w:rFonts w:ascii="Arial" w:hAnsi="Arial" w:cs="Arial"/>
+          <w:sz w:val="24"/>
+          <w:szCs w:val="24"/>
+        </w:rPr>
+        <w:t xml:space="preserve"> a disponibilidade de vagas antes de confirmar.</w:t>
       </w:r>
     </w:p>
     <w:p>
@@ -4276,12 +4165,6 @@
         <w:gridCol w:w="3038"/>
       </w:tblGrid>
       <w:tr>
-        <w:tblPrEx>
-          <w:tblCellMar>
-            <w:top w:w="0" w:type="dxa"/>
-            <w:bottom w:w="0" w:type="dxa"/>
-          </w:tblCellMar>
-        </w:tblPrEx>
         <w:trPr>
           <w:tblHeader/>
         </w:trPr>
@@ -4415,12 +4298,6 @@
         </w:tc>
       </w:tr>
       <w:tr>
-        <w:tblPrEx>
-          <w:tblCellMar>
-            <w:top w:w="0" w:type="dxa"/>
-            <w:bottom w:w="0" w:type="dxa"/>
-          </w:tblCellMar>
-        </w:tblPrEx>
         <w:tc>
           <w:tcPr>
             <w:tcW w:w="1200" w:type="dxa"/>
@@ -4551,6 +4428,7 @@
           <w:sz w:val="24"/>
           <w:szCs w:val="24"/>
         </w:rPr>
+        <w:lastRenderedPageBreak/>
         <w:t>8. Referências</w:t>
       </w:r>
     </w:p>
@@ -4634,7 +4512,7 @@
 </file>
 
 <file path=word/numbering.xml><?xml version="1.0" encoding="utf-8"?>
-<w:numbering xmlns:wpc="http://schemas.microsoft.com/office/word/2010/wordprocessingCanvas" xmlns:cx="http://schemas.microsoft.com/office/drawing/2014/chartex" xmlns:cx1="http://schemas.microsoft.com/office/drawing/2015/9/8/chartex" xmlns:cx2="http://schemas.microsoft.com/office/drawing/2015/10/21/chartex" xmlns:cx3="http://schemas.microsoft.com/office/drawing/2016/5/9/chartex" xmlns:cx4="http://schemas.microsoft.com/office/drawing/2016/5/10/chartex" xmlns:cx5="http://schemas.microsoft.com/office/drawing/2016/5/11/chartex" xmlns:cx6="http://schemas.microsoft.com/office/drawing/2016/5/12/chartex" xmlns:cx7="http://schemas.microsoft.com/office/drawing/2016/5/13/chartex" xmlns:cx8="http://schemas.microsoft.com/office/drawing/2016/5/14/chartex" xmlns:mc="http://schemas.openxmlformats.org/markup-compatibility/2006" xmlns:aink="http://schemas.microsoft.com/office/drawing/2016/ink" xmlns:am3d="http://schemas.microsoft.com/office/drawing/2017/model3d" xmlns:o="urn:schemas-microsoft-com:office:office" xmlns:oel="http://schemas.microsoft.com/office/2019/extlst" xmlns:r="http://schemas.openxmlformats.org/officeDocument/2006/relationships" xmlns:m="http://schemas.openxmlformats.org/officeDocument/2006/math" xmlns:v="urn:schemas-microsoft-com:vml" xmlns:wp14="http://schemas.microsoft.com/office/word/2010/wordprocessingDrawing" xmlns:wp="http://schemas.openxmlformats.org/drawingml/2006/wordprocessingDrawing" xmlns:w10="urn:schemas-microsoft-com:office:word" xmlns:w="http://schemas.openxmlformats.org/wordprocessingml/2006/main" xmlns:w14="http://schemas.microsoft.com/office/word/2010/wordml" xmlns:w15="http://schemas.microsoft.com/office/word/2012/wordml" xmlns:w16cex="http://schemas.microsoft.com/office/word/2018/wordml/cex" xmlns:w16cid="http://schemas.microsoft.com/office/word/2016/wordml/cid" xmlns:w16="http://schemas.microsoft.com/office/word/2018/wordml" xmlns:w16sdtdh="http://schemas.microsoft.com/office/word/2020/wordml/sdtdatahash" xmlns:w16se="http://schemas.microsoft.com/office/word/2015/wordml/symex" xmlns:wpg="http://schemas.microsoft.com/office/word/2010/wordprocessingGroup" xmlns:wpi="http://schemas.microsoft.com/office/word/2010/wordprocessingInk" xmlns:wne="http://schemas.microsoft.com/office/word/2006/wordml" xmlns:wps="http://schemas.microsoft.com/office/word/2010/wordprocessingShape" mc:Ignorable="w14 w15 w16se w16cid w16 w16cex w16sdtdh wp14">
+<w:numbering xmlns:wpc="http://schemas.microsoft.com/office/word/2010/wordprocessingCanvas" xmlns:cx="http://schemas.microsoft.com/office/drawing/2014/chartex" xmlns:cx1="http://schemas.microsoft.com/office/drawing/2015/9/8/chartex" xmlns:cx2="http://schemas.microsoft.com/office/drawing/2015/10/21/chartex" xmlns:cx3="http://schemas.microsoft.com/office/drawing/2016/5/9/chartex" xmlns:cx4="http://schemas.microsoft.com/office/drawing/2016/5/10/chartex" xmlns:cx5="http://schemas.microsoft.com/office/drawing/2016/5/11/chartex" xmlns:cx6="http://schemas.microsoft.com/office/drawing/2016/5/12/chartex" xmlns:cx7="http://schemas.microsoft.com/office/drawing/2016/5/13/chartex" xmlns:cx8="http://schemas.microsoft.com/office/drawing/2016/5/14/chartex" xmlns:mc="http://schemas.openxmlformats.org/markup-compatibility/2006" xmlns:aink="http://schemas.microsoft.com/office/drawing/2016/ink" xmlns:am3d="http://schemas.microsoft.com/office/drawing/2017/model3d" xmlns:o="urn:schemas-microsoft-com:office:office" xmlns:oel="http://schemas.microsoft.com/office/2019/extlst" xmlns:r="http://schemas.openxmlformats.org/officeDocument/2006/relationships" xmlns:m="http://schemas.openxmlformats.org/officeDocument/2006/math" xmlns:v="urn:schemas-microsoft-com:vml" xmlns:wp14="http://schemas.microsoft.com/office/word/2010/wordprocessingDrawing" xmlns:wp="http://schemas.openxmlformats.org/drawingml/2006/wordprocessingDrawing" xmlns:w10="urn:schemas-microsoft-com:office:word" xmlns:w="http://schemas.openxmlformats.org/wordprocessingml/2006/main" xmlns:w14="http://schemas.microsoft.com/office/word/2010/wordml" xmlns:w15="http://schemas.microsoft.com/office/word/2012/wordml" xmlns:w16cex="http://schemas.microsoft.com/office/word/2018/wordml/cex" xmlns:w16cid="http://schemas.microsoft.com/office/word/2016/wordml/cid" xmlns:w16="http://schemas.microsoft.com/office/word/2018/wordml" xmlns:w16du="http://schemas.microsoft.com/office/word/2023/wordml/word16du" xmlns:w16sdtdh="http://schemas.microsoft.com/office/word/2020/wordml/sdtdatahash" xmlns:w16sdtfl="http://schemas.microsoft.com/office/word/2024/wordml/sdtformatlock" xmlns:w16se="http://schemas.microsoft.com/office/word/2015/wordml/symex" xmlns:wpg="http://schemas.microsoft.com/office/word/2010/wordprocessingGroup" xmlns:wpi="http://schemas.microsoft.com/office/word/2010/wordprocessingInk" xmlns:wne="http://schemas.microsoft.com/office/word/2006/wordml" xmlns:wps="http://schemas.microsoft.com/office/word/2010/wordprocessingShape" mc:Ignorable="w14 w15 w16se w16cid w16 w16cex w16sdtdh w16sdtfl w16du wp14">
   <w:abstractNum w:abstractNumId="0" w15:restartNumberingAfterBreak="0">
     <w:nsid w:val="17472DE9"/>
     <w:multiLevelType w:val="hybridMultilevel"/>
@@ -4959,7 +4837,7 @@
 </file>
 
 <file path=word/styles.xml><?xml version="1.0" encoding="utf-8"?>
-<w:styles xmlns:mc="http://schemas.openxmlformats.org/markup-compatibility/2006" xmlns:r="http://schemas.openxmlformats.org/officeDocument/2006/relationships" xmlns:w="http://schemas.openxmlformats.org/wordprocessingml/2006/main" xmlns:w14="http://schemas.microsoft.com/office/word/2010/wordml" xmlns:w15="http://schemas.microsoft.com/office/word/2012/wordml" xmlns:w16cex="http://schemas.microsoft.com/office/word/2018/wordml/cex" xmlns:w16cid="http://schemas.microsoft.com/office/word/2016/wordml/cid" xmlns:w16="http://schemas.microsoft.com/office/word/2018/wordml" xmlns:w16sdtdh="http://schemas.microsoft.com/office/word/2020/wordml/sdtdatahash" xmlns:w16se="http://schemas.microsoft.com/office/word/2015/wordml/symex" mc:Ignorable="w14 w15 w16se w16cid w16 w16cex w16sdtdh">
+<w:styles xmlns:mc="http://schemas.openxmlformats.org/markup-compatibility/2006" xmlns:r="http://schemas.openxmlformats.org/officeDocument/2006/relationships" xmlns:w="http://schemas.openxmlformats.org/wordprocessingml/2006/main" xmlns:w14="http://schemas.microsoft.com/office/word/2010/wordml" xmlns:w15="http://schemas.microsoft.com/office/word/2012/wordml" xmlns:w16cex="http://schemas.microsoft.com/office/word/2018/wordml/cex" xmlns:w16cid="http://schemas.microsoft.com/office/word/2016/wordml/cid" xmlns:w16="http://schemas.microsoft.com/office/word/2018/wordml" xmlns:w16du="http://schemas.microsoft.com/office/word/2023/wordml/word16du" xmlns:w16sdtdh="http://schemas.microsoft.com/office/word/2020/wordml/sdtdatahash" xmlns:w16sdtfl="http://schemas.microsoft.com/office/word/2024/wordml/sdtformatlock" xmlns:w16se="http://schemas.microsoft.com/office/word/2015/wordml/symex" mc:Ignorable="w14 w15 w16se w16cid w16 w16cex w16sdtdh w16sdtfl w16du">
   <w:docDefaults>
     <w:rPrDefault>
       <w:rPr>

</xml_diff>